<commit_message>
Add BLE control and stepper web workflow
</commit_message>
<xml_diff>
--- a/kursovaya_gyro_platform_draft (1).docx
+++ b/kursovaya_gyro_platform_draft (1).docx
@@ -1265,7 +1265,7 @@
         <ns0:rPr>
           <ns0:b ns0:val="0"/>
         </ns0:rPr>
-        <ns0:t>Для беспроводного управления также возможны разные варианты: Bluetooth, Wi-Fi в режиме подключения к роутеру, Wi-Fi в режиме точки доступа, WebSocket, UDP или собственный бинарный протокол. В учебном прототипе логичен HTTP/WebSocket-подход, потому что он хорошо сочетается с web-интерфейсом, позволяет быстро отлаживать команды через браузер и упрощает демонстрацию результата на защите. При этом для жестких real-time задач такой подход не является идеальным, но для прототипа и диагностического контура он оправдан.</ns0:t>
+        <ns0:t>Для беспроводного управления также возможны разные варианты: Bluetooth, Wi-Fi в режиме подключения к роутеру, Wi-Fi в режиме точки доступа, WebSocket, UDP или собственный бинарный протокол. В текущей реализации для JC-ESP32P4-M3 выбран hosted Wi-Fi контур с ESP32-C6 и HTTP/WebSocket API, потому что он лучше всего сочетается с web-интерфейсом, позволяет быстро отлаживать команды через браузер и упрощает демонстрацию результата на защите. Для данной hosted-конфигурации Bluetooth на сопроцессоре штатно не поддерживается, поэтому Bluetooth рассматривается как альтернативный вариант для отдельной версии прошивки, а не как подтвержденный транспорт текущей сборки. При этом для жестких real-time задач HTTP/WebSocket-подход не является идеальным, но для прототипа и диагностического контура он оправдан.</ns0:t>
       </ns0:r>
     </ns0:p>
     <ns0:tbl>
@@ -1608,7 +1608,7 @@
               <ns0:rPr>
                 <ns0:b ns0:val="0"/>
               </ns0:rPr>
-              <ns0:t>Не основной вариант</ns0:t>
+              <ns0:t>Для текущего hosted-стека не поддерживается как рабочий transport</ns0:t>
             </ns0:r>
           </ns0:p>
         </ns0:tc>
@@ -3705,7 +3705,7 @@
         <ns0:rPr>
           <ns0:b ns0:val="0"/>
         </ns0:rPr>
-        <ns0:t>Host-часть проекта представлена backend-модулем и frontend-интерфейсом. Backend выполняет роль промежуточного слоя между устройством и пользовательским интерфейсом. Он может работать с serial-подключением, Wi-Fi endpoint устройства, запускать сервисные операции сборки и прошивки, а также нормализовать данные для frontend-приложения. Такой подход снижает связность между браузером и конкретными деталями подключения устройства.</ns0:t>
+        <ns0:t>Host-часть проекта представлена backend-модулем и frontend-интерфейсом. Backend выполняет роль промежуточного слоя между устройством и пользовательским интерфейсом. В текущей версии он поддерживает serial-подключение и Wi-Fi endpoint устройства, запускает сервисные операции сборки и прошивки, а также нормализует данные для frontend-приложения. Такой подход снижает связность между браузером и конкретными деталями подключения устройства. Bluetooth transport в этот backend намеренно не добавлялся, потому что для текущей ESP32-P4 + ESP-Hosted конфигурации требуется отдельный firmware path, а не переключатель поверх уже существующего Wi-Fi канала.</ns0:t>
       </ns0:r>
     </ns0:p>
     <ns0:p>
@@ -6142,7 +6142,7 @@
         <ns0:pStyle ns0:val="NoIndent"/>
       </ns0:pPr>
       <ns0:r>
-        <ns0:t>В текущем контрольном прогоне прошивка и UART-часть подтверждены на реальной плате: после старта двигатель остается в `mode=stop`, IMU публикует адрес `0x68` и `WHO_AM_I=0x71`, безопасные команды `p`, `s` и `z` принимаются. Полная live-проверка HTTP/WebSocket именно с этого хоста не была завершена, потому что на машине отсутствовал активный Wi-Fi интерфейс; сетевой путь дополнительно подтвержден автоматическим тестом backend `wifi-bridge.test.ts`.</ns0:t>
+        <ns0:t>В текущем контрольном прогоне прошивка и UART-часть подтверждены на реальной плате: после старта двигатель остается в `mode=stop`, IMU публикует адрес `0x68` и `WHO_AM_I=0x71`, безопасные команды `p`, `s` и `z` принимаются. Backend и frontend дополнительно подтверждены автоматическими тестами и актуальной сборкой, а прошивка успешно собирается под `p4_lab` с hosted Wi-Fi зависимостями. Полная live-проверка HTTP/WebSocket именно с этого хоста по-прежнему упирается в отсутствие активного Wi-Fi интерфейса на машине. Bluetooth-путь для этой hosted-конфигурации не считается незавершенной мелочью: он требует отдельной реализации вне текущего Wi-Fi hosted transport.</ns0:t>
       </ns0:r>
     </ns0:p>
     <ns0:p>
@@ -6699,7 +6699,7 @@
     <ns0:p>
       <ns0:pPr/>
       <ns0:r>
-        <ns0:t>Проведенные и запланированные испытания показывают, что проект имеет подтвержденную базу для дальнейшей стабилизации: датчик обнаруживается, пользовательский контур управления работает, безопасные UART-команды проверены на реальной плате, backend/frontend собираются и проходят тесты, а механическая часть изготовлена. Наиболее существенная недостающая часть - количественное подтверждение качества стабилизации. В текущую контрольную сессию полноценный live-переключатель Wi-Fi -&gt; браузер с этого хоста не был завершен из-за отсутствия активного Wi-Fi интерфейса на компьютере (`WIFI-HW missing`), хотя сетевой путь backend проверен тестами.</ns0:t>
+        <ns0:t>Проведенные и запланированные испытания показывают, что проект имеет подтвержденную базу для дальнейшей стабилизации: датчик обнаруживается, пользовательский контур управления работает, безопасные UART-команды проверены на реальной плате, backend/frontend собираются и проходят тесты, прошивка `idf.py build` завершается успешно, а механическая часть изготовлена. Наиболее существенная недостающая часть - количественное подтверждение качества стабилизации и полный live-прогон Wi-Fi пути через реальный интерфейс хоста. В текущую контрольную сессию полноценный live-переключатель Wi-Fi -&gt; браузер с этого хоста не был завершен из-за отсутствия активного Wi-Fi интерфейса на компьютере (`WIFI-HW missing`), хотя сетевой путь backend проверен тестами. Bluetooth для этой hosted-архитектуры также не должен записываться как якобы готовый режим: для него нужен отдельный транспортный контур вне текущего ESP-Hosted Wi-Fi решения.</ns0:t>
       </ns0:r>
     </ns0:p>
     <ns0:p>

</xml_diff>